<commit_message>
feat: robo Selic validado, instalador Windows, slides com IAs gratuitas e QR
- corrige consulta ao BCB (ultimos/N limitado a 20 -> consulta por periodo)
- contingencia (ultima consulta salva / exemplo) sempre avisada na tela, Excel e PDF
- corrige formato da aba Resumo (valores apareciam como 1475,00%)
- instalador sem Python/administrador, com atalhos e desinstalacao
- slide 07 com IAs gratuitas, slides 08-10 com dados reais, QR definitivo
- prompt completo validado (reproduz o mesmo PDF), guia, apostila e roteiro atualizados

Co-Authored-By: Claude Opus 5.5 <noreply@anthropic.com>
</commit_message>
<xml_diff>
--- a/Guia-Executivo-BMA-Profissional.docx
+++ b/Guia-Executivo-BMA-Profissional.docx
@@ -387,7 +387,7 @@
                 <w:sz w:val="44"/>
                 <w:szCs w:val="44"/>
               </w:rPr>
-              <w:t>3 saídas</w:t>
+              <w:t>4 saídas</w:t>
             </w:r>
           </w:p>
           <w:p>
@@ -414,7 +414,7 @@
                 <w:sz w:val="18"/>
                 <w:szCs w:val="18"/>
               </w:rPr>
-              <w:t>Planilha, gráfico e resumo executivo.</w:t>
+              <w:t>Excel, gráfico, PDF e log.</w:t>
             </w:r>
           </w:p>
         </w:tc>
@@ -522,7 +522,7 @@
         <w:rPr>
           <w:color w:val="4B5563"/>
         </w:rPr>
-        <w:t>Entregáveis em Excel e gráfico</w:t>
+        <w:t>Entregáveis em Excel, gráfico e PDF</w:t>
       </w:r>
     </w:p>
     <w:p>
@@ -1669,7 +1669,7 @@
                 <w:sz w:val="18"/>
                 <w:szCs w:val="18"/>
               </w:rPr>
-              <w:t>Excel, gráfico e resumo.</w:t>
+              <w:t>Excel, gráfico, PDF e log.</w:t>
             </w:r>
           </w:p>
         </w:tc>
@@ -1985,7 +1985,7 @@
                 <w:sz w:val="18"/>
                 <w:szCs w:val="18"/>
               </w:rPr>
-              <w:t>Dados dos últimos 30 dias em uma aba do Excel.</w:t>
+              <w:t>Últimas 30 observações na aba Dados do Excel.</w:t>
             </w:r>
           </w:p>
         </w:tc>
@@ -2143,7 +2143,7 @@
                 <w:sz w:val="18"/>
                 <w:szCs w:val="18"/>
               </w:rPr>
-              <w:t>Gráfico e resumo textual do período.</w:t>
+              <w:t>Gráfico e relatório PDF com resumo do período.</w:t>
             </w:r>
           </w:p>
         </w:tc>
@@ -2513,7 +2513,7 @@
               <w:rPr>
                 <w:color w:val="4B5563"/>
               </w:rPr>
-              <w:t>Relatorio_Selic_Bacen.xlsx, Grafico_Selic.png e cache local.</w:t>
+              <w:t>selic.xlsx, selic.png, resumo_selic.pdf, oficina.log e cópia da última consulta.</w:t>
             </w:r>
           </w:p>
         </w:tc>
@@ -2545,7 +2545,7 @@
         <w:rPr>
           <w:color w:val="4B5563"/>
         </w:rPr>
-        <w:t>Selic anualizada — amostra dos últimos dias registrados.</w:t>
+        <w:t>Selic anualizada — últimas observações (consulta de 23/09/2026).</w:t>
       </w:r>
     </w:p>
     <w:tbl>
@@ -2673,7 +2673,7 @@
                 <w:b/>
                 <w:bCs/>
               </w:rPr>
-              <w:t>07-01 00</w:t>
+              <w:t>23/09/2026</w:t>
             </w:r>
           </w:p>
         </w:tc>
@@ -2700,19 +2700,7 @@
               <w:rPr>
                 <w:color w:val="4B5563"/>
               </w:rPr>
-              <w:t>14,</w:t>
-            </w:r>
-            <w:r>
-              <w:rPr>
-                <w:color w:val="4B5563"/>
-              </w:rPr>
-              <w:t>1</w:t>
-            </w:r>
-            <w:r>
-              <w:rPr>
-                <w:color w:val="4B5563"/>
-              </w:rPr>
-              <w:t>5</w:t>
+              <w:t>13,65</w:t>
             </w:r>
           </w:p>
         </w:tc>
@@ -2748,7 +2736,7 @@
                 <w:b/>
                 <w:bCs/>
               </w:rPr>
-              <w:t>07-01 12</w:t>
+              <w:t>22/09/2026</w:t>
             </w:r>
           </w:p>
         </w:tc>
@@ -2775,19 +2763,7 @@
               <w:rPr>
                 <w:color w:val="4B5563"/>
               </w:rPr>
-              <w:t>14,</w:t>
-            </w:r>
-            <w:r>
-              <w:rPr>
-                <w:color w:val="4B5563"/>
-              </w:rPr>
-              <w:t>1</w:t>
-            </w:r>
-            <w:r>
-              <w:rPr>
-                <w:color w:val="4B5563"/>
-              </w:rPr>
-              <w:t>5</w:t>
+              <w:t>13,65</w:t>
             </w:r>
           </w:p>
         </w:tc>
@@ -2823,7 +2799,7 @@
                 <w:b/>
                 <w:bCs/>
               </w:rPr>
-              <w:t>07-02 00</w:t>
+              <w:t>21/09/2026</w:t>
             </w:r>
           </w:p>
         </w:tc>
@@ -2850,19 +2826,7 @@
               <w:rPr>
                 <w:color w:val="4B5563"/>
               </w:rPr>
-              <w:t>14,</w:t>
-            </w:r>
-            <w:r>
-              <w:rPr>
-                <w:color w:val="4B5563"/>
-              </w:rPr>
-              <w:t>1</w:t>
-            </w:r>
-            <w:r>
-              <w:rPr>
-                <w:color w:val="4B5563"/>
-              </w:rPr>
-              <w:t>5</w:t>
+              <w:t>13,65</w:t>
             </w:r>
           </w:p>
         </w:tc>
@@ -2898,7 +2862,7 @@
                 <w:b/>
                 <w:bCs/>
               </w:rPr>
-              <w:t>07-02 12</w:t>
+              <w:t>18/09/2026</w:t>
             </w:r>
           </w:p>
         </w:tc>
@@ -2925,19 +2889,7 @@
               <w:rPr>
                 <w:color w:val="4B5563"/>
               </w:rPr>
-              <w:t>14,</w:t>
-            </w:r>
-            <w:r>
-              <w:rPr>
-                <w:color w:val="4B5563"/>
-              </w:rPr>
-              <w:t>1</w:t>
-            </w:r>
-            <w:r>
-              <w:rPr>
-                <w:color w:val="4B5563"/>
-              </w:rPr>
-              <w:t>5</w:t>
+              <w:t>13,65</w:t>
             </w:r>
           </w:p>
         </w:tc>
@@ -2973,7 +2925,7 @@
                 <w:b/>
                 <w:bCs/>
               </w:rPr>
-              <w:t>07-03 00</w:t>
+              <w:t>17/09/2026</w:t>
             </w:r>
           </w:p>
         </w:tc>
@@ -3000,19 +2952,7 @@
               <w:rPr>
                 <w:color w:val="4B5563"/>
               </w:rPr>
-              <w:t>14,</w:t>
-            </w:r>
-            <w:r>
-              <w:rPr>
-                <w:color w:val="4B5563"/>
-              </w:rPr>
-              <w:t>1</w:t>
-            </w:r>
-            <w:r>
-              <w:rPr>
-                <w:color w:val="4B5563"/>
-              </w:rPr>
-              <w:t>5</w:t>
+              <w:t>13,65</w:t>
             </w:r>
           </w:p>
         </w:tc>
@@ -3048,7 +2988,7 @@
                 <w:b/>
                 <w:bCs/>
               </w:rPr>
-              <w:t>07-03 12</w:t>
+              <w:t>16/09/2026</w:t>
             </w:r>
           </w:p>
         </w:tc>
@@ -3075,19 +3015,7 @@
               <w:rPr>
                 <w:color w:val="4B5563"/>
               </w:rPr>
-              <w:t>14,</w:t>
-            </w:r>
-            <w:r>
-              <w:rPr>
-                <w:color w:val="4B5563"/>
-              </w:rPr>
-              <w:t>1</w:t>
-            </w:r>
-            <w:r>
-              <w:rPr>
-                <w:color w:val="4B5563"/>
-              </w:rPr>
-              <w:t>5</w:t>
+              <w:t>13,90</w:t>
             </w:r>
           </w:p>
         </w:tc>
@@ -3123,7 +3051,7 @@
                 <w:b/>
                 <w:bCs/>
               </w:rPr>
-              <w:t>07-04 00</w:t>
+              <w:t>15/09/2026</w:t>
             </w:r>
           </w:p>
         </w:tc>
@@ -3150,19 +3078,7 @@
               <w:rPr>
                 <w:color w:val="4B5563"/>
               </w:rPr>
-              <w:t>14,</w:t>
-            </w:r>
-            <w:r>
-              <w:rPr>
-                <w:color w:val="4B5563"/>
-              </w:rPr>
-              <w:t>1</w:t>
-            </w:r>
-            <w:r>
-              <w:rPr>
-                <w:color w:val="4B5563"/>
-              </w:rPr>
-              <w:t>5</w:t>
+              <w:t>13,90</w:t>
             </w:r>
           </w:p>
         </w:tc>
@@ -3441,7 +3357,7 @@
                 <w:sz w:val="18"/>
                 <w:szCs w:val="18"/>
               </w:rPr>
-              <w:t>Crie um script em Python, compatível com Windows e utilizando apenas</w:t>
+              <w:t>Crie um programa em Python, compatível com Windows e utilizando apenas</w:t>
             </w:r>
           </w:p>
           <w:p>
@@ -3469,7 +3385,7 @@
                 <w:sz w:val="18"/>
                 <w:szCs w:val="18"/>
               </w:rPr>
-              <w:t>do Brasil, série 1178 (Selic anualizada base 252), e obtenha os dados</w:t>
+              <w:t>do Brasil, série 1178 (Selic anualizada base 252), e obtenha as últimas</w:t>
             </w:r>
           </w:p>
           <w:p>
@@ -3483,7 +3399,7 @@
                 <w:sz w:val="18"/>
                 <w:szCs w:val="18"/>
               </w:rPr>
-              <w:t>dos últimos 30 dias.</w:t>
+              <w:t>30 observações.</w:t>
             </w:r>
           </w:p>
         </w:tc>
@@ -3599,7 +3515,7 @@
         <w:rPr>
           <w:color w:val="4B5563"/>
         </w:rPr>
-        <w:t>gerar um resumo executivo do comportamento no período;</w:t>
+        <w:t>gerar um relatório PDF com os indicadores e o gráfico, e abri-lo ao final;</w:t>
       </w:r>
     </w:p>
     <w:p>
@@ -3615,7 +3531,7 @@
         <w:rPr>
           <w:color w:val="4B5563"/>
         </w:rPr>
-        <w:t>salvar os arquivos em uma pasta chamada saida;</w:t>
+        <w:t>salvar os resultados na pasta output e registrar a execução em logs/oficina.log;</w:t>
       </w:r>
     </w:p>
     <w:p>
@@ -3631,7 +3547,7 @@
         <w:rPr>
           <w:color w:val="4B5563"/>
         </w:rPr>
-        <w:t>criar um cache local para uso em caso de indisponibilidade da internet;</w:t>
+        <w:t>salvar a última consulta e usá-la, com aviso claro, se a internet estiver indisponível;</w:t>
       </w:r>
     </w:p>
     <w:p>
@@ -3681,7 +3597,7 @@
           <w:iCs/>
           <w:color w:val="4B5563"/>
         </w:rPr>
-        <w:t>Não utilize APIs pagas de inteligência artificial. Explique o código em blocos e mantenha as funções separadas por responsabilidade.</w:t>
+        <w:t>Não utilize APIs pagas de inteligência artificial. Explique o código em blocos e mantenha as funções separadas por responsabilidade. O prompt completo, que reproduz exatamente o robô da oficina, está em prompt/prompt_oficina.txt no repositório.</w:t>
       </w:r>
     </w:p>
     <w:p>
@@ -4316,7 +4232,7 @@
               <w:spacing w:line="276" w:lineRule="auto"/>
             </w:pPr>
             <w:r>
-              <w:t>Não insira credenciais, dados pessoais, informações de clientes, contratos ou dados internos em ferramentas públicas. Durante o treinamento, utilize somente dados públicos ou fictícios.</w:t>
+              <w:t>Opções gratuitas: ChatGPT, Claude, Gemini, Microsoft Copilot, Perplexity e NotebookLM. Não insira credenciais, dados pessoais, informações de clientes, contratos ou dados internos em ferramentas públicas. Durante o treinamento, utilize somente dados públicos ou fictícios.</w:t>
             </w:r>
           </w:p>
         </w:tc>
@@ -4432,7 +4348,7 @@
           <w:sz w:val="22"/>
           <w:szCs w:val="22"/>
         </w:rPr>
-        <w:t>Preparação do ambiente, instalação das bibliotecas e execução do exemplo.</w:t>
+        <w:t>Instalação pelo instalador (sem Python) ou execução pelo código-fonte.</w:t>
       </w:r>
     </w:p>
     <w:p>
@@ -4544,7 +4460,7 @@
                 <w:sz w:val="18"/>
                 <w:szCs w:val="18"/>
               </w:rPr>
-              <w:t>Versão 3.11 ou superior instalada.</w:t>
+              <w:t>3.11 ou superior, só para rodar pelo código. O instalador dispensa.</w:t>
             </w:r>
           </w:p>
         </w:tc>
@@ -4623,7 +4539,7 @@
                 <w:sz w:val="18"/>
                 <w:szCs w:val="18"/>
               </w:rPr>
-              <w:t>Acesso à API pública do Banco Central.</w:t>
+              <w:t>Acesso à API do Banco Central. Sem internet, usa a última consulta salva.</w:t>
             </w:r>
           </w:p>
         </w:tc>
@@ -4702,7 +4618,7 @@
                 <w:sz w:val="18"/>
                 <w:szCs w:val="18"/>
               </w:rPr>
-              <w:t>Bloco de Notas, VS Code ou similar.</w:t>
+              <w:t>VS Code ou Bloco de Notas, para ler e adaptar o código.</w:t>
             </w:r>
           </w:p>
         </w:tc>
@@ -4813,7 +4729,7 @@
               <w:rPr>
                 <w:color w:val="4B5563"/>
               </w:rPr>
-              <w:t>Crie uma pasta para o projeto, por exemplo: Oficina_Robos_BMA.</w:t>
+              <w:t>Baixe o instalador pelo QR Code ou em github.com/thaiza-commits/oficina-de-robos-bma.</w:t>
             </w:r>
           </w:p>
         </w:tc>
@@ -4879,7 +4795,7 @@
               <w:rPr>
                 <w:color w:val="4B5563"/>
               </w:rPr>
-              <w:t>Salve o arquivo robo_selic.py dentro dessa pasta.</w:t>
+              <w:t>Execute Instalador_OficinaRobos_BMA.exe e clique em Instalar.</w:t>
             </w:r>
           </w:p>
         </w:tc>
@@ -4945,7 +4861,7 @@
               <w:rPr>
                 <w:color w:val="4B5563"/>
               </w:rPr>
-              <w:t>Abra o Prompt de Comando ou PowerShell na pasta do projeto.</w:t>
+              <w:t>Abra o atalho Robô Selic na Área de Trabalho.</w:t>
             </w:r>
           </w:p>
         </w:tc>
@@ -5011,7 +4927,7 @@
               <w:rPr>
                 <w:color w:val="4B5563"/>
               </w:rPr>
-              <w:t>Confirme a instalação do Python com o comando: python --version.</w:t>
+              <w:t>Acompanhe as mensagens na janela do robô.</w:t>
             </w:r>
           </w:p>
         </w:tc>
@@ -5077,7 +4993,7 @@
               <w:rPr>
                 <w:color w:val="4B5563"/>
               </w:rPr>
-              <w:t>Instale as bibliotecas gratuitas necessárias.</w:t>
+              <w:t>Confira o relatório PDF, que abre automaticamente ao final.</w:t>
             </w:r>
           </w:p>
         </w:tc>
@@ -5143,7 +5059,7 @@
               <w:rPr>
                 <w:color w:val="4B5563"/>
               </w:rPr>
-              <w:t>Execute o robô e acompanhe as mensagens do terminal.</w:t>
+              <w:t>Abra o atalho Resultados do Robô Selic e valide o Excel (abas Dados e Resumo).</w:t>
             </w:r>
           </w:p>
         </w:tc>
@@ -5209,7 +5125,7 @@
               <w:rPr>
                 <w:color w:val="4B5563"/>
               </w:rPr>
-              <w:t>Abra a pasta saida e valide os arquivos gerados.</w:t>
+              <w:t>Rode o atalho Robô Selic (offline) e confirme o aviso de contingência.</w:t>
             </w:r>
           </w:p>
         </w:tc>
@@ -5371,7 +5287,7 @@
                 <w:sz w:val="18"/>
                 <w:szCs w:val="18"/>
               </w:rPr>
-              <w:t>pip install requests pandas openpyxl matplotlib</w:t>
+              <w:t>pip install -r codigo/requirements.txt</w:t>
             </w:r>
           </w:p>
           <w:p>
@@ -5404,7 +5320,7 @@
                 <w:sz w:val="18"/>
                 <w:szCs w:val="18"/>
               </w:rPr>
-              <w:t>python robo_selic.py</w:t>
+              <w:t>python codigo/main.py        (sem internet: --offline)</w:t>
             </w:r>
           </w:p>
         </w:tc>
@@ -5481,7 +5397,7 @@
               <w:spacing w:line="276" w:lineRule="auto"/>
             </w:pPr>
             <w:r>
-              <w:t>Utilize 01_instalar.bat na primeira vez e 02_executar_robo.bat nas execuções seguintes. Teste previamente o modo offline.</w:t>
+              <w:t>Com Python instalado, use codigo\executar_oficina.bat (instala as bibliotecas na primeira vez) ou codigo\executar_offline.bat. Teste previamente o modo offline.</w:t>
             </w:r>
           </w:p>
         </w:tc>
@@ -6015,7 +5931,7 @@
               <w:rPr>
                 <w:color w:val="4B5563"/>
               </w:rPr>
-              <w:t>Gera planilha, gráfico e resumo executivo.</w:t>
+              <w:t>Gera planilha, gráfico, relatório PDF e log.</w:t>
             </w:r>
           </w:p>
         </w:tc>
@@ -6078,7 +5994,7 @@
               <w:rPr>
                 <w:color w:val="4B5563"/>
               </w:rPr>
-              <w:t>Salva e reutiliza um cache local em caso de falha de conexão.</w:t>
+              <w:t>Salva a última consulta e a reutiliza, com aviso, em caso de falha de conexão.</w:t>
             </w:r>
           </w:p>
         </w:tc>
@@ -6196,7 +6112,7 @@
                 <w:szCs w:val="18"/>
                 <w:lang w:val="en-GB"/>
               </w:rPr>
-              <w:t>resposta = requests.get(url, params={"formato": "json"}, timeout=30)</w:t>
+              <w:t>resposta = requests.get(url, params={"formato": "json", "dataInicial": inicio, "dataFinal": fim}, timeout=30)</w:t>
             </w:r>
           </w:p>
           <w:p>
@@ -6942,7 +6858,7 @@
               <w:rPr>
                 <w:color w:val="4B5563"/>
               </w:rPr>
-              <w:t>A fonte, o período e a data de execução estão identificados.</w:t>
+              <w:t>A fonte, o período e a data de execução estão identificados (linha Fonte do Excel e rodapé do PDF).</w:t>
             </w:r>
           </w:p>
         </w:tc>

</xml_diff>

<commit_message>
feat: painel visual com identidade BMA FIDC e periodo parametrizavel (v1.1.0)
- painel_selic.html autocontido (sem internet): indicadores, Selic em degraus
  com decisoes do Copom, mudancas da taxa, media mensal e filtros 1M a 12M
- periodo: padrao 12 meses; parametros.ini, --meses/--inicio/--fim e --perguntar;
  consulta em blocos de 10 anos e 3 tentativas em quedas de conexao/5xx
- cache acumulado para contingencia; aviso quando o offline cobre so parte
- cores e logo de bmafidc.com.br no painel, PDF, Excel, grafico e apostila
- instalador: atalhos escolher periodo e parametros; preserva parametros.ini
- slides: novo slide 09 (painel), dados de 12 meses; prompt, guia, roteiro e
  README atualizados; parametros.ini tolerante a BOM/ANSI

Co-Authored-By: Claude Opus 5.5 <noreply@anthropic.com>
</commit_message>
<xml_diff>
--- a/Guia-Executivo-BMA-Profissional.docx
+++ b/Guia-Executivo-BMA-Profissional.docx
@@ -336,7 +336,7 @@
                 <w:sz w:val="18"/>
                 <w:szCs w:val="18"/>
               </w:rPr>
-              <w:t>Monitoramento da Selic com dados públicos.</w:t>
+              <w:t>Selic dos últimos 12 meses, com período configurável.</w:t>
             </w:r>
           </w:p>
         </w:tc>
@@ -387,7 +387,7 @@
                 <w:sz w:val="44"/>
                 <w:szCs w:val="44"/>
               </w:rPr>
-              <w:t>4 saídas</w:t>
+              <w:t>5 saídas</w:t>
             </w:r>
           </w:p>
           <w:p>
@@ -414,7 +414,7 @@
                 <w:sz w:val="18"/>
                 <w:szCs w:val="18"/>
               </w:rPr>
-              <w:t>Excel, gráfico, PDF e log.</w:t>
+              <w:t>Painel, Excel, gráfico, PDF e log.</w:t>
             </w:r>
           </w:p>
         </w:tc>
@@ -522,7 +522,7 @@
         <w:rPr>
           <w:color w:val="4B5563"/>
         </w:rPr>
-        <w:t>Entregáveis em Excel, gráfico e PDF</w:t>
+        <w:t>Painel visual na tela, Excel, gráfico e PDF</w:t>
       </w:r>
     </w:p>
     <w:p>
@@ -1669,7 +1669,7 @@
                 <w:sz w:val="18"/>
                 <w:szCs w:val="18"/>
               </w:rPr>
-              <w:t>Excel, gráfico, PDF e log.</w:t>
+              <w:t>Painel, Excel, gráfico, PDF e log.</w:t>
             </w:r>
           </w:p>
         </w:tc>
@@ -1985,7 +1985,7 @@
                 <w:sz w:val="18"/>
                 <w:szCs w:val="18"/>
               </w:rPr>
-              <w:t>Últimas 30 observações na aba Dados do Excel.</w:t>
+              <w:t>Últimos 12 meses (ou o período escolhido) na aba Dados.</w:t>
             </w:r>
           </w:p>
         </w:tc>
@@ -2064,7 +2064,7 @@
                 <w:sz w:val="18"/>
                 <w:szCs w:val="18"/>
               </w:rPr>
-              <w:t>Primeiro, último, maior, menor e variação.</w:t>
+              <w:t>Variação, maior, menor, média e mudanças da taxa (Copom).</w:t>
             </w:r>
           </w:p>
         </w:tc>
@@ -2143,7 +2143,7 @@
                 <w:sz w:val="18"/>
                 <w:szCs w:val="18"/>
               </w:rPr>
-              <w:t>Gráfico e relatório PDF com resumo do período.</w:t>
+              <w:t>Painel com gráficos e filtros, e relatório PDF.</w:t>
             </w:r>
           </w:p>
         </w:tc>
@@ -2450,7 +2450,7 @@
               <w:rPr>
                 <w:color w:val="4B5563"/>
               </w:rPr>
-              <w:t>Tratamento de datas e valores; cálculo dos indicadores.</w:t>
+              <w:t>Tratamento de datas e valores; indicadores e mudanças da taxa; período via parametros.ini.</w:t>
             </w:r>
           </w:p>
         </w:tc>
@@ -2513,7 +2513,7 @@
               <w:rPr>
                 <w:color w:val="4B5563"/>
               </w:rPr>
-              <w:t>selic.xlsx, selic.png, resumo_selic.pdf, oficina.log e cópia da última consulta.</w:t>
+              <w:t>painel_selic.html, selic.xlsx, selic.png, resumo_selic.pdf, oficina.log e consultas salvas.</w:t>
             </w:r>
           </w:p>
         </w:tc>
@@ -2545,7 +2545,7 @@
         <w:rPr>
           <w:color w:val="4B5563"/>
         </w:rPr>
-        <w:t>Selic anualizada — últimas observações (consulta de 23/09/2026).</w:t>
+        <w:t>Selic anualizada — mudanças da taxa nos últimos 12 meses (consulta de 23/09/2026).</w:t>
       </w:r>
     </w:p>
     <w:tbl>
@@ -2736,7 +2736,7 @@
                 <w:b/>
                 <w:bCs/>
               </w:rPr>
-              <w:t>22/09/2026</w:t>
+              <w:t>17/09/2026</w:t>
             </w:r>
           </w:p>
         </w:tc>
@@ -2799,7 +2799,7 @@
                 <w:b/>
                 <w:bCs/>
               </w:rPr>
-              <w:t>21/09/2026</w:t>
+              <w:t>06/08/2026</w:t>
             </w:r>
           </w:p>
         </w:tc>
@@ -2826,7 +2826,7 @@
               <w:rPr>
                 <w:color w:val="4B5563"/>
               </w:rPr>
-              <w:t>13,65</w:t>
+              <w:t>13,90</w:t>
             </w:r>
           </w:p>
         </w:tc>
@@ -2862,7 +2862,7 @@
                 <w:b/>
                 <w:bCs/>
               </w:rPr>
-              <w:t>18/09/2026</w:t>
+              <w:t>18/06/2026</w:t>
             </w:r>
           </w:p>
         </w:tc>
@@ -2889,7 +2889,7 @@
               <w:rPr>
                 <w:color w:val="4B5563"/>
               </w:rPr>
-              <w:t>13,65</w:t>
+              <w:t>14,15</w:t>
             </w:r>
           </w:p>
         </w:tc>
@@ -2925,7 +2925,7 @@
                 <w:b/>
                 <w:bCs/>
               </w:rPr>
-              <w:t>17/09/2026</w:t>
+              <w:t>30/04/2026</w:t>
             </w:r>
           </w:p>
         </w:tc>
@@ -2952,7 +2952,7 @@
               <w:rPr>
                 <w:color w:val="4B5563"/>
               </w:rPr>
-              <w:t>13,65</w:t>
+              <w:t>14,40</w:t>
             </w:r>
           </w:p>
         </w:tc>
@@ -2988,7 +2988,7 @@
                 <w:b/>
                 <w:bCs/>
               </w:rPr>
-              <w:t>16/09/2026</w:t>
+              <w:t>19/03/2026</w:t>
             </w:r>
           </w:p>
         </w:tc>
@@ -3015,7 +3015,7 @@
               <w:rPr>
                 <w:color w:val="4B5563"/>
               </w:rPr>
-              <w:t>13,90</w:t>
+              <w:t>14,65</w:t>
             </w:r>
           </w:p>
         </w:tc>
@@ -3051,7 +3051,7 @@
                 <w:b/>
                 <w:bCs/>
               </w:rPr>
-              <w:t>15/09/2026</w:t>
+              <w:t>24/09/2025</w:t>
             </w:r>
           </w:p>
         </w:tc>
@@ -3078,7 +3078,7 @@
               <w:rPr>
                 <w:color w:val="4B5563"/>
               </w:rPr>
-              <w:t>13,90</w:t>
+              <w:t>14,90</w:t>
             </w:r>
           </w:p>
         </w:tc>
@@ -3385,7 +3385,7 @@
                 <w:sz w:val="18"/>
                 <w:szCs w:val="18"/>
               </w:rPr>
-              <w:t>do Brasil, série 1178 (Selic anualizada base 252), e obtenha as últimas</w:t>
+              <w:t>do Brasil, série 1178 (Selic anualizada base 252), e obtenha os últimos</w:t>
             </w:r>
           </w:p>
           <w:p>
@@ -3399,7 +3399,7 @@
                 <w:sz w:val="18"/>
                 <w:szCs w:val="18"/>
               </w:rPr>
-              <w:t>30 observações.</w:t>
+              <w:t>12 meses (período configurável).</w:t>
             </w:r>
           </w:p>
         </w:tc>
@@ -3483,7 +3483,7 @@
         <w:rPr>
           <w:color w:val="4B5563"/>
         </w:rPr>
-        <w:t>gerar uma planilha Excel com as abas Dados e Resumo;</w:t>
+        <w:t>gerar uma planilha Excel com as abas Dados, Resumo e Mudanças;</w:t>
       </w:r>
     </w:p>
     <w:p>
@@ -3499,7 +3499,7 @@
         <w:rPr>
           <w:color w:val="4B5563"/>
         </w:rPr>
-        <w:t>criar um gráfico de evolução da Selic;</w:t>
+        <w:t>criar um painel visual em HTML com indicadores, gráfico da Selic e filtros de período;</w:t>
       </w:r>
     </w:p>
     <w:p>
@@ -4993,7 +4993,7 @@
               <w:rPr>
                 <w:color w:val="4B5563"/>
               </w:rPr>
-              <w:t>Confira o relatório PDF, que abre automaticamente ao final.</w:t>
+              <w:t>Confira o painel, que abre sozinho no navegador ao final (filtros 1M a 12M).</w:t>
             </w:r>
           </w:p>
         </w:tc>
@@ -5059,7 +5059,7 @@
               <w:rPr>
                 <w:color w:val="4B5563"/>
               </w:rPr>
-              <w:t>Abra o atalho Resultados do Robô Selic e valide o Excel (abas Dados e Resumo).</w:t>
+              <w:t>Abra o atalho Resultados do Robô Selic e valide o Excel (abas Dados, Resumo e Mudanças).</w:t>
             </w:r>
           </w:p>
         </w:tc>
@@ -5125,7 +5125,7 @@
               <w:rPr>
                 <w:color w:val="4B5563"/>
               </w:rPr>
-              <w:t>Rode o atalho Robô Selic (offline) e confirme o aviso de contingência.</w:t>
+              <w:t>Teste outro período com o atalho Robô Selic (escolher período) e o modo offline.</w:t>
             </w:r>
           </w:p>
         </w:tc>
@@ -5320,7 +5320,7 @@
                 <w:sz w:val="18"/>
                 <w:szCs w:val="18"/>
               </w:rPr>
-              <w:t>python codigo/main.py        (sem internet: --offline)</w:t>
+              <w:t>python codigo/main.py --meses 12      (ou --inicio/--fim, --perguntar, --offline)</w:t>
             </w:r>
           </w:p>
         </w:tc>
@@ -5397,7 +5397,7 @@
               <w:spacing w:line="276" w:lineRule="auto"/>
             </w:pPr>
             <w:r>
-              <w:t>Com Python instalado, use codigo\executar_oficina.bat (instala as bibliotecas na primeira vez) ou codigo\executar_offline.bat. Teste previamente o modo offline.</w:t>
+              <w:t>Com Python instalado, use codigo\executar_oficina.bat (instala as bibliotecas na primeira vez), codigo\executar_escolher_periodo.bat ou codigo\executar_offline.bat. O período padrão fica em parametros.ini. Teste previamente o modo offline.</w:t>
             </w:r>
           </w:p>
         </w:tc>
@@ -5742,7 +5742,7 @@
               <w:rPr>
                 <w:color w:val="4B5563"/>
               </w:rPr>
-              <w:t>Busca a série oficial no período solicitado e trata indisponibilidades.</w:t>
+              <w:t>Busca a série oficial no período escolhido, em blocos de até 10 anos, com novas tentativas.</w:t>
             </w:r>
           </w:p>
         </w:tc>
@@ -5931,7 +5931,7 @@
               <w:rPr>
                 <w:color w:val="4B5563"/>
               </w:rPr>
-              <w:t>Gera planilha, gráfico, relatório PDF e log.</w:t>
+              <w:t>Gera painel visual, planilha, gráfico, relatório PDF e log.</w:t>
             </w:r>
           </w:p>
         </w:tc>
@@ -6769,7 +6769,7 @@
               <w:rPr>
                 <w:color w:val="4B5563"/>
               </w:rPr>
-              <w:t>As abas Dados e Resumo foram geradas e o gráfico representa a mesma série.</w:t>
+              <w:t>O painel e as abas Dados, Resumo e Mudanças mostram a mesma série e o mesmo período.</w:t>
             </w:r>
           </w:p>
         </w:tc>

</xml_diff>

<commit_message>
docs: prompt curto do slide 06 reescrito e testado; quebras de linha do prompt corrigidas
- versao curta cobre os pontos em que a IA erra sem instrucao: dataInicial/dataFinal,
  aviso de contingencia (sem inventar dados), painel HTML offline com filtros
  funcionais, parametros.ini e cores BMA
- slide 06, apostila, guia, README e roteiro deixam claro que o slide e um resumo
  e que o prompt completo (QR) reproduz o robo da demonstracao
- prompt_oficina.txt estava com todas as quebras de linha duplicadas
- robo (codigo/) inalterado; instalador refeito so para levar os textos novos

Co-Authored-By: Claude Opus 5.5 <noreply@anthropic.com>
</commit_message>
<xml_diff>
--- a/Guia-Executivo-BMA-Profissional.docx
+++ b/Guia-Executivo-BMA-Profissional.docx
@@ -3399,7 +3399,7 @@
                 <w:sz w:val="18"/>
                 <w:szCs w:val="18"/>
               </w:rPr>
-              <w:t>12 meses (período configurável).</w:t>
+              <w:t>12 meses (período configurável), usando dataInicial e dataFinal.</w:t>
             </w:r>
           </w:p>
         </w:tc>
@@ -3435,7 +3435,7 @@
         <w:rPr>
           <w:color w:val="4B5563"/>
         </w:rPr>
-        <w:t>tratar erros de conexão, ausência de dados e falhas de conversão;</w:t>
+        <w:t>tratar erros de conexão e, se a internet falhar, usar a última consulta salva avisando em destaque (nunca inventar dados);</w:t>
       </w:r>
     </w:p>
     <w:p>
@@ -3499,7 +3499,7 @@
         <w:rPr>
           <w:color w:val="4B5563"/>
         </w:rPr>
-        <w:t>criar um painel visual em HTML com indicadores, gráfico da Selic e filtros de período;</w:t>
+        <w:t>criar um painel HTML que abra sem internet, com indicadores, gráfico da Selic e filtros de período que funcionem no navegador, nas cores da BMA (#1B172D e #F37522);</w:t>
       </w:r>
     </w:p>
     <w:p>
@@ -3597,7 +3597,7 @@
           <w:iCs/>
           <w:color w:val="4B5563"/>
         </w:rPr>
-        <w:t>Não utilize APIs pagas de inteligência artificial. Explique o código em blocos e mantenha as funções separadas por responsabilidade. O prompt completo, que reproduz exatamente o robô da oficina, está em prompt/prompt_oficina.txt no repositório.</w:t>
+        <w:t>Não utilize APIs pagas de inteligência artificial. Explique o código em blocos e mantenha as funções separadas por responsabilidade. Este modelo é um resumo: o prompt completo, que reproduz exatamente o robô da demonstração (painel, contingência, parâmetros e layout), está em prompt/prompt_oficina.txt no repositório.</w:t>
       </w:r>
     </w:p>
     <w:p>

</xml_diff>